<commit_message>
Add employer organization approval blocks to topic bank
Co-Authored-By: Claude Opus 5.5 <noreply@anthropic.com>
Claude-Session: https://claude.ai/code/session_01HgSkVwspteZUq1Kdgo42wt
</commit_message>
<xml_diff>
--- a/Magistrlik_dissertatsiya_mavzulari_banki.docx
+++ b/Magistrlik_dissertatsiya_mavzulari_banki.docx
@@ -2,26 +2,223 @@
 <file path=word/document.xml><?xml version="1.0" encoding="utf-8"?>
 <w:document xmlns:wpc="http://schemas.microsoft.com/office/word/2010/wordprocessingCanvas" xmlns:mc="http://schemas.openxmlformats.org/markup-compatibility/2006" xmlns:o="urn:schemas-microsoft-com:office:office" xmlns:r="http://schemas.openxmlformats.org/officeDocument/2006/relationships" xmlns:m="http://schemas.openxmlformats.org/officeDocument/2006/math" xmlns:v="urn:schemas-microsoft-com:vml" xmlns:wp14="http://schemas.microsoft.com/office/word/2010/wordprocessingDrawing" xmlns:wp="http://schemas.openxmlformats.org/drawingml/2006/wordprocessingDrawing" xmlns:w10="urn:schemas-microsoft-com:office:word" xmlns:w="http://schemas.openxmlformats.org/wordprocessingml/2006/main" xmlns:w14="http://schemas.microsoft.com/office/word/2010/wordml" xmlns:w15="http://schemas.microsoft.com/office/word/2012/wordml" xmlns:wpg="http://schemas.microsoft.com/office/word/2010/wordprocessingGroup" xmlns:wpi="http://schemas.microsoft.com/office/word/2010/wordprocessingInk" xmlns:wne="http://schemas.microsoft.com/office/word/2006/wordml" xmlns:wps="http://schemas.microsoft.com/office/word/2010/wordprocessingShape" xmlns:cx="http://schemas.microsoft.com/office/drawing/2014/chartex" xmlns:cx1="http://schemas.microsoft.com/office/drawing/2015/9/8/chartex" xmlns:cx2="http://schemas.microsoft.com/office/drawing/2015/10/21/chartex" xmlns:cx3="http://schemas.microsoft.com/office/drawing/2016/5/9/chartex" xmlns:cx4="http://schemas.microsoft.com/office/drawing/2016/5/10/chartex" xmlns:cx5="http://schemas.microsoft.com/office/drawing/2016/5/11/chartex" xmlns:cx6="http://schemas.microsoft.com/office/drawing/2016/5/12/chartex" xmlns:cx7="http://schemas.microsoft.com/office/drawing/2016/5/13/chartex" xmlns:cx8="http://schemas.microsoft.com/office/drawing/2016/5/14/chartex" xmlns:aink="http://schemas.microsoft.com/office/drawing/2016/ink" xmlns:am3d="http://schemas.microsoft.com/office/drawing/2017/model3d" xmlns:w16cex="http://schemas.microsoft.com/office/word/2018/wordml/cex" xmlns:w16cid="http://schemas.microsoft.com/office/word/2016/wordml/cid" xmlns:w16="http://schemas.microsoft.com/office/word/2018/wordml" xmlns:w16sdtdh="http://schemas.microsoft.com/office/word/2020/wordml/sdtdatahash" xmlns:w16se="http://schemas.microsoft.com/office/word/2015/wordml/symex" mc:Ignorable="w14 w15 wp14">
   <w:body>
+    <w:tbl>
+      <w:tblPr>
+        <w:tblW w:type="dxa" w:w="9355"/>
+        <w:tblBorders>
+          <w:top w:val="none" w:color="FFFFFF" w:sz="0"/>
+          <w:left w:val="none" w:color="FFFFFF" w:sz="0"/>
+          <w:bottom w:val="none" w:color="FFFFFF" w:sz="0"/>
+          <w:right w:val="none" w:color="FFFFFF" w:sz="0"/>
+          <w:insideH w:val="none" w:color="FFFFFF" w:sz="0"/>
+          <w:insideV w:val="none" w:color="FFFFFF" w:sz="0"/>
+        </w:tblBorders>
+      </w:tblPr>
+      <w:tblGrid>
+        <w:gridCol w:w="4677"/>
+        <w:gridCol w:w="4678"/>
+      </w:tblGrid>
+      <w:tr>
+        <w:tc>
+          <w:tcPr>
+            <w:tcW w:type="dxa" w:w="4677"/>
+            <w:tcBorders>
+              <w:top w:val="none" w:color="FFFFFF" w:sz="0"/>
+              <w:left w:val="none" w:color="FFFFFF" w:sz="0"/>
+              <w:bottom w:val="none" w:color="FFFFFF" w:sz="0"/>
+              <w:right w:val="none" w:color="FFFFFF" w:sz="0"/>
+            </w:tcBorders>
+          </w:tcPr>
+          <w:p>
+            <w:pPr>
+              <w:spacing w:after="60" w:before="0"/>
+            </w:pPr>
+            <w:r>
+              <w:rPr>
+                <w:rFonts w:ascii="Times New Roman" w:cs="Times New Roman" w:eastAsia="Times New Roman" w:hAnsi="Times New Roman"/>
+                <w:b/>
+                <w:bCs/>
+                <w:sz w:val="28"/>
+                <w:szCs w:val="28"/>
+              </w:rPr>
+              <w:t xml:space="preserve">“KELISHILDI”</w:t>
+            </w:r>
+          </w:p>
+          <w:p>
+            <w:pPr>
+              <w:spacing w:after="0" w:before="0"/>
+            </w:pPr>
+            <w:r>
+              <w:rPr>
+                <w:rFonts w:ascii="Times New Roman" w:cs="Times New Roman" w:eastAsia="Times New Roman" w:hAnsi="Times New Roman"/>
+                <w:sz w:val="28"/>
+                <w:szCs w:val="28"/>
+              </w:rPr>
+              <w:t xml:space="preserve">Ish beruvchi tashkilot:</w:t>
+            </w:r>
+          </w:p>
+          <w:p>
+            <w:pPr>
+              <w:spacing w:after="0" w:before="0"/>
+            </w:pPr>
+            <w:r>
+              <w:rPr>
+                <w:rFonts w:ascii="Times New Roman" w:cs="Times New Roman" w:eastAsia="Times New Roman" w:hAnsi="Times New Roman"/>
+                <w:sz w:val="28"/>
+                <w:szCs w:val="28"/>
+              </w:rPr>
+              <w:t xml:space="preserve">______________________________</w:t>
+            </w:r>
+          </w:p>
+          <w:p>
+            <w:pPr>
+              <w:spacing w:after="60" w:before="0"/>
+            </w:pPr>
+            <w:r>
+              <w:rPr>
+                <w:rFonts w:ascii="Times New Roman" w:cs="Times New Roman" w:eastAsia="Times New Roman" w:hAnsi="Times New Roman"/>
+                <w:sz w:val="28"/>
+                <w:szCs w:val="28"/>
+              </w:rPr>
+              <w:t xml:space="preserve">rahbari</w:t>
+            </w:r>
+          </w:p>
+          <w:p>
+            <w:pPr>
+              <w:spacing w:after="60" w:before="0"/>
+            </w:pPr>
+            <w:r>
+              <w:rPr>
+                <w:rFonts w:ascii="Times New Roman" w:cs="Times New Roman" w:eastAsia="Times New Roman" w:hAnsi="Times New Roman"/>
+                <w:sz w:val="28"/>
+                <w:szCs w:val="28"/>
+              </w:rPr>
+              <w:t xml:space="preserve">__________ _______________</w:t>
+            </w:r>
+          </w:p>
+          <w:p>
+            <w:pPr>
+              <w:spacing w:after="0" w:before="0"/>
+            </w:pPr>
+            <w:r>
+              <w:rPr>
+                <w:rFonts w:ascii="Times New Roman" w:cs="Times New Roman" w:eastAsia="Times New Roman" w:hAnsi="Times New Roman"/>
+                <w:sz w:val="28"/>
+                <w:szCs w:val="28"/>
+              </w:rPr>
+              <w:t xml:space="preserve">“____” ____________ 2026-yil</w:t>
+            </w:r>
+          </w:p>
+          <w:p>
+            <w:pPr>
+              <w:spacing w:after="0" w:before="0"/>
+            </w:pPr>
+            <w:r>
+              <w:rPr>
+                <w:rFonts w:ascii="Times New Roman" w:cs="Times New Roman" w:eastAsia="Times New Roman" w:hAnsi="Times New Roman"/>
+                <w:sz w:val="22"/>
+                <w:szCs w:val="22"/>
+              </w:rPr>
+              <w:t xml:space="preserve">M.O‘.</w:t>
+            </w:r>
+          </w:p>
+        </w:tc>
+        <w:tc>
+          <w:tcPr>
+            <w:tcW w:type="dxa" w:w="4678"/>
+            <w:tcBorders>
+              <w:top w:val="none" w:color="FFFFFF" w:sz="0"/>
+              <w:left w:val="none" w:color="FFFFFF" w:sz="0"/>
+              <w:bottom w:val="none" w:color="FFFFFF" w:sz="0"/>
+              <w:right w:val="none" w:color="FFFFFF" w:sz="0"/>
+            </w:tcBorders>
+          </w:tcPr>
+          <w:p>
+            <w:pPr>
+              <w:spacing w:after="60" w:before="0"/>
+            </w:pPr>
+            <w:r>
+              <w:rPr>
+                <w:rFonts w:ascii="Times New Roman" w:cs="Times New Roman" w:eastAsia="Times New Roman" w:hAnsi="Times New Roman"/>
+                <w:b/>
+                <w:bCs/>
+                <w:sz w:val="28"/>
+                <w:szCs w:val="28"/>
+              </w:rPr>
+              <w:t xml:space="preserve">“TASDIQLAYMAN”</w:t>
+            </w:r>
+          </w:p>
+          <w:p>
+            <w:pPr>
+              <w:spacing w:after="0" w:before="0"/>
+            </w:pPr>
+            <w:r>
+              <w:rPr>
+                <w:rFonts w:ascii="Times New Roman" w:cs="Times New Roman" w:eastAsia="Times New Roman" w:hAnsi="Times New Roman"/>
+                <w:sz w:val="28"/>
+                <w:szCs w:val="28"/>
+              </w:rPr>
+              <w:t xml:space="preserve">______________________________</w:t>
+            </w:r>
+          </w:p>
+          <w:p>
+            <w:pPr>
+              <w:spacing w:after="0" w:before="0"/>
+            </w:pPr>
+            <w:r>
+              <w:rPr>
+                <w:rFonts w:ascii="Times New Roman" w:cs="Times New Roman" w:eastAsia="Times New Roman" w:hAnsi="Times New Roman"/>
+                <w:sz w:val="28"/>
+                <w:szCs w:val="28"/>
+              </w:rPr>
+              <w:t xml:space="preserve">universiteti o‘quv ishlari</w:t>
+            </w:r>
+          </w:p>
+          <w:p>
+            <w:pPr>
+              <w:spacing w:after="60" w:before="0"/>
+            </w:pPr>
+            <w:r>
+              <w:rPr>
+                <w:rFonts w:ascii="Times New Roman" w:cs="Times New Roman" w:eastAsia="Times New Roman" w:hAnsi="Times New Roman"/>
+                <w:sz w:val="28"/>
+                <w:szCs w:val="28"/>
+              </w:rPr>
+              <w:t xml:space="preserve">bo‘yicha prorektori</w:t>
+            </w:r>
+          </w:p>
+          <w:p>
+            <w:pPr>
+              <w:spacing w:after="60" w:before="0"/>
+            </w:pPr>
+            <w:r>
+              <w:rPr>
+                <w:rFonts w:ascii="Times New Roman" w:cs="Times New Roman" w:eastAsia="Times New Roman" w:hAnsi="Times New Roman"/>
+                <w:sz w:val="28"/>
+                <w:szCs w:val="28"/>
+              </w:rPr>
+              <w:t xml:space="preserve">__________ _______________</w:t>
+            </w:r>
+          </w:p>
+          <w:p>
+            <w:pPr>
+              <w:spacing w:after="0" w:before="0"/>
+            </w:pPr>
+            <w:r>
+              <w:rPr>
+                <w:rFonts w:ascii="Times New Roman" w:cs="Times New Roman" w:eastAsia="Times New Roman" w:hAnsi="Times New Roman"/>
+                <w:sz w:val="28"/>
+                <w:szCs w:val="28"/>
+              </w:rPr>
+              <w:t xml:space="preserve">“____” ____________ 2026-yil</w:t>
+            </w:r>
+          </w:p>
+        </w:tc>
+      </w:tr>
+    </w:tbl>
     <w:p>
       <w:pPr>
-        <w:spacing w:after="60" w:before="0"/>
-        <w:jc w:val="right"/>
-      </w:pPr>
-      <w:r>
-        <w:rPr>
-          <w:rFonts w:ascii="Times New Roman" w:cs="Times New Roman" w:eastAsia="Times New Roman" w:hAnsi="Times New Roman"/>
-          <w:b/>
-          <w:bCs/>
-          <w:sz w:val="28"/>
-          <w:szCs w:val="28"/>
-        </w:rPr>
-        <w:t xml:space="preserve">“TASDIQLAYMAN”</w:t>
-      </w:r>
-    </w:p>
-    <w:p>
-      <w:pPr>
-        <w:spacing w:after="0" w:before="0"/>
-        <w:jc w:val="right"/>
+        <w:spacing w:after="240" w:before="0"/>
       </w:pPr>
       <w:r>
         <w:rPr>
@@ -29,49 +226,7 @@
           <w:sz w:val="28"/>
           <w:szCs w:val="28"/>
         </w:rPr>
-        <w:t xml:space="preserve">_____________________ universiteti</w:t>
-      </w:r>
-    </w:p>
-    <w:p>
-      <w:pPr>
-        <w:spacing w:after="60" w:before="0"/>
-        <w:jc w:val="right"/>
-      </w:pPr>
-      <w:r>
-        <w:rPr>
-          <w:rFonts w:ascii="Times New Roman" w:cs="Times New Roman" w:eastAsia="Times New Roman" w:hAnsi="Times New Roman"/>
-          <w:sz w:val="28"/>
-          <w:szCs w:val="28"/>
-        </w:rPr>
-        <w:t xml:space="preserve">o‘quv ishlari bo‘yicha prorektori</w:t>
-      </w:r>
-    </w:p>
-    <w:p>
-      <w:pPr>
-        <w:spacing w:after="60" w:before="0"/>
-        <w:jc w:val="right"/>
-      </w:pPr>
-      <w:r>
-        <w:rPr>
-          <w:rFonts w:ascii="Times New Roman" w:cs="Times New Roman" w:eastAsia="Times New Roman" w:hAnsi="Times New Roman"/>
-          <w:sz w:val="28"/>
-          <w:szCs w:val="28"/>
-        </w:rPr>
-        <w:t xml:space="preserve">______________ ___________________</w:t>
-      </w:r>
-    </w:p>
-    <w:p>
-      <w:pPr>
-        <w:spacing w:after="360" w:before="0"/>
-        <w:jc w:val="right"/>
-      </w:pPr>
-      <w:r>
-        <w:rPr>
-          <w:rFonts w:ascii="Times New Roman" w:cs="Times New Roman" w:eastAsia="Times New Roman" w:hAnsi="Times New Roman"/>
-          <w:sz w:val="28"/>
-          <w:szCs w:val="28"/>
-        </w:rPr>
-        <w:t xml:space="preserve">“____” ______________ 2026-yil</w:t>
+        <w:t xml:space="preserve"/>
       </w:r>
     </w:p>
     <w:p>
@@ -4397,9 +4552,112 @@
     </w:p>
     <w:p>
       <w:pPr>
+        <w:spacing w:after="120" w:before="240"/>
+      </w:pPr>
+      <w:r>
+        <w:rPr>
+          <w:rFonts w:ascii="Times New Roman" w:cs="Times New Roman" w:eastAsia="Times New Roman" w:hAnsi="Times New Roman"/>
+          <w:b/>
+          <w:bCs/>
+          <w:sz w:val="28"/>
+          <w:szCs w:val="28"/>
+        </w:rPr>
+        <w:t xml:space="preserve">Ish beruvchi tashkilotlar bilan kelishildi:</w:t>
+      </w:r>
+    </w:p>
+    <w:p>
+      <w:pPr>
+        <w:spacing w:after="60" w:before="120"/>
+      </w:pPr>
+      <w:r>
+        <w:rPr>
+          <w:rFonts w:ascii="Times New Roman" w:cs="Times New Roman" w:eastAsia="Times New Roman" w:hAnsi="Times New Roman"/>
+          <w:sz w:val="28"/>
+          <w:szCs w:val="28"/>
+        </w:rPr>
+        <w:t xml:space="preserve">1. ________________________________________________ rahbari</w:t>
+      </w:r>
+    </w:p>
+    <w:p>
+      <w:pPr>
+        <w:tabs>
+          <w:tab w:val="left" w:pos="300"/>
+        </w:tabs>
+        <w:spacing w:after="60" w:before="0"/>
+      </w:pPr>
+      <w:r>
+        <w:rPr>
+          <w:rFonts w:ascii="Times New Roman" w:cs="Times New Roman" w:eastAsia="Times New Roman" w:hAnsi="Times New Roman"/>
+          <w:sz w:val="28"/>
+          <w:szCs w:val="28"/>
+        </w:rPr>
+        <w:t xml:space="preserve">	__________ ___________________   “____” __________ 2026-yil   M.O‘.</w:t>
+      </w:r>
+    </w:p>
+    <w:p>
+      <w:pPr>
+        <w:spacing w:after="60" w:before="120"/>
+      </w:pPr>
+      <w:r>
+        <w:rPr>
+          <w:rFonts w:ascii="Times New Roman" w:cs="Times New Roman" w:eastAsia="Times New Roman" w:hAnsi="Times New Roman"/>
+          <w:sz w:val="28"/>
+          <w:szCs w:val="28"/>
+        </w:rPr>
+        <w:t xml:space="preserve">2. ________________________________________________ rahbari</w:t>
+      </w:r>
+    </w:p>
+    <w:p>
+      <w:pPr>
+        <w:tabs>
+          <w:tab w:val="left" w:pos="300"/>
+        </w:tabs>
+        <w:spacing w:after="60" w:before="0"/>
+      </w:pPr>
+      <w:r>
+        <w:rPr>
+          <w:rFonts w:ascii="Times New Roman" w:cs="Times New Roman" w:eastAsia="Times New Roman" w:hAnsi="Times New Roman"/>
+          <w:sz w:val="28"/>
+          <w:szCs w:val="28"/>
+        </w:rPr>
+        <w:t xml:space="preserve">	__________ ___________________   “____” __________ 2026-yil   M.O‘.</w:t>
+      </w:r>
+    </w:p>
+    <w:p>
+      <w:pPr>
+        <w:spacing w:after="60" w:before="120"/>
+      </w:pPr>
+      <w:r>
+        <w:rPr>
+          <w:rFonts w:ascii="Times New Roman" w:cs="Times New Roman" w:eastAsia="Times New Roman" w:hAnsi="Times New Roman"/>
+          <w:sz w:val="28"/>
+          <w:szCs w:val="28"/>
+        </w:rPr>
+        <w:t xml:space="preserve">3. ________________________________________________ rahbari</w:t>
+      </w:r>
+    </w:p>
+    <w:p>
+      <w:pPr>
+        <w:tabs>
+          <w:tab w:val="left" w:pos="300"/>
+        </w:tabs>
+        <w:spacing w:after="60" w:before="0"/>
+      </w:pPr>
+      <w:r>
+        <w:rPr>
+          <w:rFonts w:ascii="Times New Roman" w:cs="Times New Roman" w:eastAsia="Times New Roman" w:hAnsi="Times New Roman"/>
+          <w:sz w:val="28"/>
+          <w:szCs w:val="28"/>
+        </w:rPr>
+        <w:t xml:space="preserve">	__________ ___________________   “____” __________ 2026-yil   M.O‘.</w:t>
+      </w:r>
+    </w:p>
+    <w:p>
+      <w:pPr>
         <w:tabs>
           <w:tab w:val="left" w:pos="4200"/>
         </w:tabs>
+        <w:spacing w:after="0" w:before="240"/>
       </w:pPr>
       <w:r>
         <w:rPr>

</xml_diff>